<commit_message>
docs: update sprint documentation with new start and end dates, and project name change to Civitas-backend
</commit_message>
<xml_diff>
--- a/documentation/Sprint Documentation atualizada.docx
+++ b/documentation/Sprint Documentation atualizada.docx
@@ -174,6 +174,13 @@
               </w:rPr>
               <w:t xml:space="preserve"> 07/04</w:t>
             </w:r>
+            <w:r>
+              <w:rPr>
+                <w:b/>
+                <w:bCs/>
+              </w:rPr>
+              <w:t>/26</w:t>
+            </w:r>
           </w:p>
         </w:tc>
         <w:tc>
@@ -201,6 +208,13 @@
                 <w:bCs/>
               </w:rPr>
               <w:t xml:space="preserve"> 13/04</w:t>
+            </w:r>
+            <w:r>
+              <w:rPr>
+                <w:b/>
+                <w:bCs/>
+              </w:rPr>
+              <w:t>/26</w:t>
             </w:r>
           </w:p>
         </w:tc>
@@ -275,6 +289,13 @@
                 <w:bCs/>
               </w:rPr>
               <w:t>Civitas</w:t>
+            </w:r>
+            <w:r>
+              <w:rPr>
+                <w:b/>
+                <w:bCs/>
+              </w:rPr>
+              <w:t>-backend</w:t>
             </w:r>
             <w:proofErr w:type="spellEnd"/>
           </w:p>
@@ -532,6 +553,9 @@
             <w:r>
               <w:t>07/04</w:t>
             </w:r>
+            <w:r>
+              <w:t>/26</w:t>
+            </w:r>
           </w:p>
         </w:tc>
         <w:tc>
@@ -541,6 +565,9 @@
           <w:p>
             <w:r>
               <w:t>13/04</w:t>
+            </w:r>
+            <w:r>
+              <w:t>/26</w:t>
             </w:r>
           </w:p>
         </w:tc>
@@ -1179,37 +1206,50 @@
       </w:r>
     </w:p>
     <w:p>
+      <w:pPr>
+        <w:rPr>
+          <w:lang w:val="en-US"/>
+        </w:rPr>
+      </w:pPr>
+      <w:r>
+        <w:rPr>
+          <w:lang w:val="en-US"/>
+        </w:rPr>
+        <w:t xml:space="preserve">public Status </w:t>
+      </w:r>
       <w:proofErr w:type="spellStart"/>
       <w:r>
-        <w:t>public</w:t>
+        <w:rPr>
+          <w:lang w:val="en-US"/>
+        </w:rPr>
+        <w:t>Status</w:t>
       </w:r>
       <w:proofErr w:type="spellEnd"/>
       <w:r>
-        <w:t xml:space="preserve"> Status </w:t>
-      </w:r>
-      <w:proofErr w:type="spellStart"/>
-      <w:r>
-        <w:t>Status</w:t>
-      </w:r>
-      <w:proofErr w:type="spellEnd"/>
-      <w:r>
+        <w:rPr>
+          <w:lang w:val="en-US"/>
+        </w:rPr>
         <w:t xml:space="preserve"> </w:t>
       </w:r>
       <w:proofErr w:type="gramStart"/>
       <w:r>
-        <w:t xml:space="preserve">{ </w:t>
-      </w:r>
-      <w:proofErr w:type="spellStart"/>
-      <w:r>
-        <w:t>get</w:t>
-      </w:r>
-      <w:proofErr w:type="spellEnd"/>
+        <w:rPr>
+          <w:lang w:val="en-US"/>
+        </w:rPr>
+        <w:t>{ get</w:t>
+      </w:r>
       <w:proofErr w:type="gramEnd"/>
       <w:r>
+        <w:rPr>
+          <w:lang w:val="en-US"/>
+        </w:rPr>
         <w:t>; set</w:t>
       </w:r>
       <w:proofErr w:type="gramStart"/>
       <w:r>
+        <w:rPr>
+          <w:lang w:val="en-US"/>
+        </w:rPr>
         <w:t>; }</w:t>
       </w:r>
       <w:proofErr w:type="gramEnd"/>
@@ -1570,37 +1610,44 @@
     </w:p>
     <w:p/>
     <w:p>
-      <w:r>
-        <w:t xml:space="preserve">  Enum Status (</w:t>
+      <w:pPr>
+        <w:rPr>
+          <w:lang w:val="en-US"/>
+        </w:rPr>
+      </w:pPr>
+      <w:r>
+        <w:t xml:space="preserve">  </w:t>
+      </w:r>
+      <w:r>
+        <w:rPr>
+          <w:lang w:val="en-US"/>
+        </w:rPr>
+        <w:t>Enum Status (Objects/Enums/</w:t>
       </w:r>
       <w:proofErr w:type="spellStart"/>
       <w:r>
-        <w:t>Objects</w:t>
+        <w:rPr>
+          <w:lang w:val="en-US"/>
+        </w:rPr>
+        <w:t>Status.cs</w:t>
       </w:r>
       <w:proofErr w:type="spellEnd"/>
       <w:r>
-        <w:t>/</w:t>
-      </w:r>
-      <w:proofErr w:type="spellStart"/>
-      <w:r>
-        <w:t>Enums</w:t>
-      </w:r>
-      <w:proofErr w:type="spellEnd"/>
-      <w:r>
-        <w:t>/</w:t>
-      </w:r>
-      <w:proofErr w:type="spellStart"/>
-      <w:r>
-        <w:t>Status.cs</w:t>
-      </w:r>
-      <w:proofErr w:type="spellEnd"/>
-      <w:r>
+        <w:rPr>
+          <w:lang w:val="en-US"/>
+        </w:rPr>
         <w:t>)</w:t>
       </w:r>
     </w:p>
     <w:p>
       <w:r>
-        <w:t xml:space="preserve">  - Valores renomeados para </w:t>
+        <w:rPr>
+          <w:lang w:val="en-US"/>
+        </w:rPr>
+        <w:t xml:space="preserve">  </w:t>
+      </w:r>
+      <w:r>
+        <w:t xml:space="preserve">- Valores renomeados para </w:t>
       </w:r>
       <w:proofErr w:type="spellStart"/>
       <w:r>
@@ -1966,7 +2013,71 @@
       <w:pPr>
         <w:shd w:val="clear" w:color="auto" w:fill="000000" w:themeFill="text1"/>
         <w:jc w:val="center"/>
-      </w:pPr>
+        <w:rPr>
+          <w:b/>
+          <w:bCs/>
+          <w:color w:val="FFFFFF" w:themeColor="background1"/>
+          <w:sz w:val="24"/>
+          <w:szCs w:val="24"/>
+        </w:rPr>
+      </w:pPr>
+      <w:r>
+        <w:drawing>
+          <wp:anchor distT="0" distB="0" distL="114300" distR="114300" simplePos="0" relativeHeight="251658240" behindDoc="1" locked="0" layoutInCell="1" allowOverlap="1" wp14:anchorId="6596596D" wp14:editId="2B3CEA13">
+            <wp:simplePos x="0" y="0"/>
+            <wp:positionH relativeFrom="margin">
+              <wp:align>left</wp:align>
+            </wp:positionH>
+            <wp:positionV relativeFrom="paragraph">
+              <wp:posOffset>334645</wp:posOffset>
+            </wp:positionV>
+            <wp:extent cx="3653155" cy="696727"/>
+            <wp:effectExtent l="0" t="0" r="4445" b="8255"/>
+            <wp:wrapNone/>
+            <wp:docPr id="1665221088" name="Imagem 1"/>
+            <wp:cNvGraphicFramePr>
+              <a:graphicFrameLocks xmlns:a="http://schemas.openxmlformats.org/drawingml/2006/main" noChangeAspect="1"/>
+            </wp:cNvGraphicFramePr>
+            <a:graphic xmlns:a="http://schemas.openxmlformats.org/drawingml/2006/main">
+              <a:graphicData uri="http://schemas.openxmlformats.org/drawingml/2006/picture">
+                <pic:pic xmlns:pic="http://schemas.openxmlformats.org/drawingml/2006/picture">
+                  <pic:nvPicPr>
+                    <pic:cNvPr id="1665221088" name=""/>
+                    <pic:cNvPicPr/>
+                  </pic:nvPicPr>
+                  <pic:blipFill>
+                    <a:blip r:embed="rId8" cstate="print">
+                      <a:extLst>
+                        <a:ext uri="{28A0092B-C50C-407E-A947-70E740481C1C}">
+                          <a14:useLocalDpi xmlns:a14="http://schemas.microsoft.com/office/drawing/2010/main" val="0"/>
+                        </a:ext>
+                      </a:extLst>
+                    </a:blip>
+                    <a:stretch>
+                      <a:fillRect/>
+                    </a:stretch>
+                  </pic:blipFill>
+                  <pic:spPr>
+                    <a:xfrm>
+                      <a:off x="0" y="0"/>
+                      <a:ext cx="3653155" cy="696727"/>
+                    </a:xfrm>
+                    <a:prstGeom prst="rect">
+                      <a:avLst/>
+                    </a:prstGeom>
+                  </pic:spPr>
+                </pic:pic>
+              </a:graphicData>
+            </a:graphic>
+            <wp14:sizeRelH relativeFrom="margin">
+              <wp14:pctWidth>0</wp14:pctWidth>
+            </wp14:sizeRelH>
+            <wp14:sizeRelV relativeFrom="margin">
+              <wp14:pctHeight>0</wp14:pctHeight>
+            </wp14:sizeRelV>
+          </wp:anchor>
+        </w:drawing>
+      </w:r>
       <w:r>
         <w:rPr>
           <w:b/>
@@ -3254,6 +3365,7 @@
   <w:style w:type="character" w:default="1" w:styleId="Fontepargpadro">
     <w:name w:val="Default Paragraph Font"/>
     <w:uiPriority w:val="1"/>
+    <w:semiHidden/>
     <w:unhideWhenUsed/>
   </w:style>
   <w:style w:type="table" w:default="1" w:styleId="Tabelanormal">

</xml_diff>